<commit_message>
Update evaluation forms: add AACSB status, combine Jackie Lewis
Changes:
- Set all instructors to "Instructional Practitioner" AACSB status
- Combined Jacqueline Lewis into one form with both courses:
  - MBA 625 Managerial Accounting (4 dates)
  - 668 Info Tech Mgmt (4 dates)
- Now 32 forms (down from 33 due to combining duplicate)

https://claude.ai/code/session_019joi3KhwMT9HyLdFbSuVpw
</commit_message>
<xml_diff>
--- a/Generated_Evaluations_Batch1/PTL_Evaluation_Amanda_Lucas.docx
+++ b/Generated_Evaluations_Batch1/PTL_Evaluation_Amanda_Lucas.docx
@@ -75,18 +75,12 @@
         </w:rPr>
         <w:t xml:space="preserve">Faculty AACSB Status: </w:t>
       </w:r>
-      <w:r/>
-      <w:sdt>
-        <w:sdtPr>
-          <w:tag w:val="AACSBStatus"/>
-          <w:alias w:val="AACSBStatus"/>
-        </w:sdtPr>
-        <w:sdtContent>
-          <w:r>
-            <w:t>[Click to enter AACSB status]</w:t>
-          </w:r>
-        </w:sdtContent>
-      </w:sdt>
+      <w:r>
+        <w:rPr>
+          <w:rFonts w:ascii="Times New Roman" w:hAnsi="Times New Roman"/>
+        </w:rPr>
+        <w:t>Instructional Practitioner</w:t>
+      </w:r>
     </w:p>
     <w:p/>
     <w:p>

</xml_diff>